<commit_message>
M5, M6, M7 e M8
</commit_message>
<xml_diff>
--- a/Modelo TCC Engenharia de Software 2022.docx
+++ b/Modelo TCC Engenharia de Software 2022.docx
@@ -5987,7 +5987,77 @@
               <w:rPr>
                 <w:sz w:val="20"/>
               </w:rPr>
-              <w:t>Baseline Ridge e Random Forest; tuning do XGBoost com GroupKFold por município; modelo serializado</w:t>
+              <w:t>Módulos train.py e evaluate.py; baselines Ridge e Random Forest avaliados com GroupKFold por município e validação temporal; métricas registradas em CSV; melhor baseline serializado; tuning do XGBoost pendente</w:t>
+            </w:r>
+          </w:p>
+        </w:tc>
+        <w:tc>
+          <w:tcPr>
+            <w:tcW w:w="2268" w:type="dxa"/>
+          </w:tcPr>
+          <w:p>
+            <w:r>
+              <w:rPr>
+                <w:sz w:val="20"/>
+              </w:rPr>
+              <w:t>Em andamento (baselines concluídos)</w:t>
+            </w:r>
+          </w:p>
+        </w:tc>
+      </w:tr>
+      <w:tr>
+        <w:tblPrEx>
+          <w:tblBorders>
+            <w:top w:val="single" w:color="auto" w:sz="4" w:space="0"/>
+            <w:left w:val="single" w:color="auto" w:sz="4" w:space="0"/>
+            <w:bottom w:val="single" w:color="auto" w:sz="4" w:space="0"/>
+            <w:right w:val="single" w:color="auto" w:sz="4" w:space="0"/>
+            <w:insideH w:val="single" w:color="auto" w:sz="4" w:space="0"/>
+            <w:insideV w:val="single" w:color="auto" w:sz="4" w:space="0"/>
+          </w:tblBorders>
+          <w:tblCellMar>
+            <w:top w:w="0" w:type="dxa"/>
+            <w:left w:w="108" w:type="dxa"/>
+            <w:bottom w:w="0" w:type="dxa"/>
+            <w:right w:w="108" w:type="dxa"/>
+          </w:tblCellMar>
+        </w:tblPrEx>
+        <w:tc>
+          <w:tcPr>
+            <w:tcW w:w="2268" w:type="dxa"/>
+          </w:tcPr>
+          <w:p>
+            <w:r>
+              <w:rPr>
+                <w:sz w:val="20"/>
+              </w:rPr>
+              <w:t>5. Explicabilidade e análise de resíduos</w:t>
+            </w:r>
+          </w:p>
+        </w:tc>
+        <w:tc>
+          <w:tcPr>
+            <w:tcW w:w="2268" w:type="dxa"/>
+          </w:tcPr>
+          <w:p>
+            <w:r>
+              <w:rPr>
+                <w:sz w:val="20"/>
+              </w:rPr>
+              <w:t>Avaliação</w:t>
+            </w:r>
+          </w:p>
+        </w:tc>
+        <w:tc>
+          <w:tcPr>
+            <w:tcW w:w="2268" w:type="dxa"/>
+          </w:tcPr>
+          <w:p>
+            <w:r>
+              <w:rPr>
+                <w:sz w:val="20"/>
+              </w:rPr>
+              <w:t>Análise SHAP global e local; identificação de escolas com abandono acima/abaixo do esperado pelo perfil</w:t>
             </w:r>
           </w:p>
         </w:tc>
@@ -6031,76 +6101,6 @@
               <w:rPr>
                 <w:sz w:val="20"/>
               </w:rPr>
-              <w:t>5. Explicabilidade e análise de resíduos</w:t>
-            </w:r>
-          </w:p>
-        </w:tc>
-        <w:tc>
-          <w:tcPr>
-            <w:tcW w:w="2268" w:type="dxa"/>
-          </w:tcPr>
-          <w:p>
-            <w:r>
-              <w:rPr>
-                <w:sz w:val="20"/>
-              </w:rPr>
-              <w:t>Avaliação</w:t>
-            </w:r>
-          </w:p>
-        </w:tc>
-        <w:tc>
-          <w:tcPr>
-            <w:tcW w:w="2268" w:type="dxa"/>
-          </w:tcPr>
-          <w:p>
-            <w:r>
-              <w:rPr>
-                <w:sz w:val="20"/>
-              </w:rPr>
-              <w:t>Análise SHAP global e local; identificação de escolas com abandono acima/abaixo do esperado pelo perfil</w:t>
-            </w:r>
-          </w:p>
-        </w:tc>
-        <w:tc>
-          <w:tcPr>
-            <w:tcW w:w="2268" w:type="dxa"/>
-          </w:tcPr>
-          <w:p>
-            <w:r>
-              <w:rPr>
-                <w:sz w:val="20"/>
-              </w:rPr>
-              <w:t>Planejada</w:t>
-            </w:r>
-          </w:p>
-        </w:tc>
-      </w:tr>
-      <w:tr>
-        <w:tblPrEx>
-          <w:tblBorders>
-            <w:top w:val="single" w:color="auto" w:sz="4" w:space="0"/>
-            <w:left w:val="single" w:color="auto" w:sz="4" w:space="0"/>
-            <w:bottom w:val="single" w:color="auto" w:sz="4" w:space="0"/>
-            <w:right w:val="single" w:color="auto" w:sz="4" w:space="0"/>
-            <w:insideH w:val="single" w:color="auto" w:sz="4" w:space="0"/>
-            <w:insideV w:val="single" w:color="auto" w:sz="4" w:space="0"/>
-          </w:tblBorders>
-          <w:tblCellMar>
-            <w:top w:w="0" w:type="dxa"/>
-            <w:left w:w="108" w:type="dxa"/>
-            <w:bottom w:w="0" w:type="dxa"/>
-            <w:right w:w="108" w:type="dxa"/>
-          </w:tblCellMar>
-        </w:tblPrEx>
-        <w:tc>
-          <w:tcPr>
-            <w:tcW w:w="2268" w:type="dxa"/>
-          </w:tcPr>
-          <w:p>
-            <w:r>
-              <w:rPr>
-                <w:sz w:val="20"/>
-              </w:rPr>
               <w:t>6. Dashboard</w:t>
             </w:r>
           </w:p>
@@ -6223,6 +6223,29 @@
     </w:p>
     <w:p>
       <w:pPr>
+        <w:pStyle w:val="4"/>
+      </w:pPr>
+      <w:r>
+        <w:t>Modelagem Baseline</w:t>
+      </w:r>
+    </w:p>
+    <w:p>
+      <w:r>
+        <w:t>A quarta fase iniciou a etapa de modelagem com a construção dos modelos de referência previstos na metodologia, implementados nos módulos train.py e evaluate.py. O pipeline de pré-processamento, definido com o ColumnTransformer do scikit-learn, aplica imputação por mediana e padronização às variáveis numéricas e codificação one-hot à mesorregião, única variável categórica nominal. Três modelos foram avaliados: um DummyRegressor que prediz a média do treino, como piso trivial de referência; a regressão Ridge, como baseline linear; e o Random Forest, como baseline não-linear. Os hiperparâmetros foram selecionados por busca em grade com a própria validação cruzada agrupada (Ridge com alfa=100; Random Forest com 300 árvores, profundidade máxima 8 e mínimo de 5 observações por folha). Avaliaram-se ainda transformações do target (logaritmo e raiz quadrada), com efeito marginal sobre as métricas: a raiz quadrada beneficiou levemente o Ridge, e a ausência de transformação, o Random Forest.</w:t>
+      </w:r>
+    </w:p>
+    <w:p>
+      <w:r>
+        <w:t>A avaliação seguiu dois protocolos complementares. Na validação cruzada GroupKFold, com cinco folds agrupados por município para evitar vazamento de informação entre escolas vizinhas, ambos os baselines superaram com folga o piso trivial: RMSE de 2,70 pontos percentuais (Random Forest) e 2,74 (Ridge) contra 3,32 do Dummy, correlação de Spearman de 0,44 e 0,39, respectivamente, e Precision@K (K=10%) de aproximadamente 0,50 contra 0,07. Já na validação temporal — treino com o par 2022→2023 e teste com o par 2023→2024, simulando o uso real do sistema — observou-se deslocamento de distribuição entre os ciclos: nenhum modelo superou o piso trivial em RMSE (R² negativo), pois o nível médio de abandono mudou de um ano para o outro; as métricas de ranqueamento, contudo, mantiveram-se muito superiores ao piso (Spearman de 0,37 e Precision@K de 0,42 contra 0,09). O resultado indica que os modelos preservam a capacidade de identificar quais escolas terão abandono elevado, ainda que errem a magnitude — comportamento suficiente para a pergunta de pesquisa, formulada como problema de priorização, mas que deverá ser tratado na fase de tuning.</w:t>
+      </w:r>
+    </w:p>
+    <w:p>
+      <w:r>
+        <w:t>Uma análise preliminar de resíduos antecipou a pergunta secundária de pesquisa: escolas indígenas do Sertão de Itaparica apresentaram abandono real próximo de zero apesar de um perfil contextual associado a abandono elevado, enquanto escolas de referência da Região Metropolitana do Recife apresentaram abandono acima do esperado — casos que serão aprofundados na análise de resíduos com o modelo definitivo. O melhor baseline (Ridge com transformação raiz quadrada) foi serializado em models/baseline_ridge_v1.joblib, e todas as métricas foram registradas em arquivos CSV para comparação com o XGBoost. A fase está documentada no relatório técnico correspondente (relatorio_fase5_baselines.docx).</w:t>
+      </w:r>
+    </w:p>
+    <w:p>
+      <w:pPr>
         <w:pStyle w:val="3"/>
       </w:pPr>
       <w:r>
@@ -6241,7 +6264,7 @@
     </w:p>
     <w:p>
       <w:r>
-        <w:t>b) Testes automatizados: os módulos de ETL são cobertos por testes unitários com pytest (test_etl_filters.py, test_panel.py, test_taxas.py e test_build_target.py), que validam os filtros do universo, a integridade do painel longitudinal e o parser das Taxas de Rendimento, prevenindo regressões a cada alteração no pipeline;</w:t>
+        <w:t>b) Testes automatizados: os módulos de ETL e de modelagem são cobertos por testes unitários com pytest (test_etl_filters.py, test_panel.py, test_taxas.py, test_build_target.py e test_models.py), que validam os filtros do universo, a integridade do painel longitudinal, o parser das Taxas de Rendimento, a métrica Precision@K e o não-vazamento de municípios entre os folds da validação cruzada, prevenindo regressões a cada alteração no pipeline;</w:t>
       </w:r>
     </w:p>
     <w:p>
@@ -6269,7 +6292,7 @@
     </w:p>
     <w:p>
       <w:r>
-        <w:t>Com o dataset de modelagem concluído, as próximas fases compreendem: (i) o treinamento de modelos baseline (regressão Ridge e Random Forest) para estabelecer referências de desempenho; (ii) o tuning do XGBoost com validação cruzada GroupKFold agrupada por município, evitando vazamento de informação entre escolas vizinhas; (iii) a avaliação com métricas de regressão (RMSE, MAE e R²) e de ranqueamento (correlação de Spearman e Precision@K), alinhadas ao objetivo de priorização de intervenções; (iv) a análise de explicabilidade com SHAP e a análise de resíduos para identificar escolas com abandono acima ou abaixo do esperado pelo seu perfil contextual; e (v) a construção do dashboard interativo em Streamlit voltado aos gestores da Secretaria Estadual de Educação.</w:t>
+        <w:t>Com os baselines estabelecidos, as próximas fases compreendem: (i) o tuning do XGBoost com a mesma validação cruzada GroupKFold agrupada por município, tendo como referência superar o desempenho dos baselines (RMSE ≤ 2,70 e Spearman ≥ 0,44 na validação cruzada) e avaliando mitigações para o deslocamento de nível entre ciclos observado na validação temporal; (ii) a análise de explicabilidade com SHAP e a análise de resíduos para identificar escolas com abandono acima ou abaixo do esperado pelo seu perfil contextual; e (iii) a construção do dashboard interativo em Streamlit voltado aos gestores da Secretaria Estadual de Educação.</w:t>
       </w:r>
     </w:p>
     <w:p>

</xml_diff>

<commit_message>
fase 7 shap + diagnostico
</commit_message>
<xml_diff>
--- a/Modelo TCC Engenharia de Software 2022.docx
+++ b/Modelo TCC Engenharia de Software 2022.docx
@@ -5317,7 +5317,7 @@
         </w:rPr>
       </w:pPr>
       <w:r>
-        <w:t>Este trabalho está organizado em sete capítulos. O Capítulo 1 — Introdução — contextualiza o problema da evasão escolar no Ensino Médio público de Pernambuco, define os objetivos e delimita o escopo. O Capítulo 2 — Revisão Bibliográfica — apresenta a fundamentação teórica sobre evasão escolar e aprendizado de máquina aplicado à educação, além dos trabalhos relacionados. O Capítulo 3 — Método de Desenvolvimento — descreve o pipeline de ciência de dados adotado, da coleta ao modelo. O Capítulo 4 — Arquitetura do Software — detalha os componentes do sistema (ETL, modelagem e visualização). O Capítulo 5 — Tecnologias e Implementação — apresenta as ferramentas utilizadas (Python, pandas, XGBoost, SHAP, Streamlit). O Capítulo 6 — Testes e Resultados — reporta os resultados das análises exploratórias, do feature engineering e do modelo preditivo. O Capítulo 7 — Conclusões — sintetiza as contribuições e aponta trabalhos futuros.</w:t>
+        <w:t>Este trabalho está organizado em sete capítulos. O Capítulo 1 — Introdução — contextualiza o problema da evasão escolar no Ensino Médio público de Pernambuco, define os objetivos e delimita o escopo. O Capítulo 2 — Revisão Bibliográfica — apresenta a fundamentação teórica sobre evasão escolar e aprendizado de máquina aplicado à educação, além dos trabalhos relacionados. O Capítulo 3 — Método de Desenvolvimento — descreve o pipeline de ciência de dados adotado, da coleta ao modelo. O Capítulo 4 — Arquitetura do Software — detalha os componentes do sistema (ETL, modelagem e visualização). O Capítulo 5 — Tecnologias e Implementação — apresenta as ferramentas utilizadas (Python, pandas, XGBoost, SHAP, Streamlit). O Capítulo 6 — Testes e Resultados — reporta os resultados das análises exploratórias, do feature engineering, do modelo preditivo e da explicabilidade do modelo com SHAP. O Capítulo 7 — Conclusões — sintetiza as contribuições e aponta trabalhos futuros.</w:t>
       </w:r>
     </w:p>
     <w:p>
@@ -5350,7 +5350,7 @@
         </w:rPr>
       </w:pPr>
       <w:r>
-        <w:t>Principais resultados obtidos até o momento: (i) painel longitudinal estável com 806 escolas únicas, 2.392 linhas e 97,4% de cobertura nos três anos analisados; (ii) dataset final de modelagem com 1.586 observações, 30 features e 0% de missing após imputação por média de mesorregião×ano; (iii) infraestrutura significativamente inferior nas escolas rurais (índice médio 0,52 vs. 0,71 nas urbanas; p&lt;0,0001); (iv) crescimento do ensino integral de 56,7% em 2022 para 64,9% em 2024, com 50% das escolas operando em regime 100% integral em 2024; (v) correlações Spearman mais fortes com a taxa de abandono futura: lag de abandono (r≈+0,80), distorção idade-série (r≈+0,55) e nível socioeconômico (INSE, r≈−0,40); (vi) concentração de risco nos municípios da mesorregião do São Francisco Pernambucano, que acumula menores índices de IRD e INSE e maiores taxas de abandono e distorção idade-série.</w:t>
+        <w:t>Principais resultados obtidos até o momento: (i) painel longitudinal estável com 806 escolas únicas, 2.392 linhas e 97,4% de cobertura nos três anos analisados; (ii) dataset final de modelagem com 1.586 observações, 30 features e 0% de missing após imputação por média de mesorregião×ano; (iii) infraestrutura significativamente inferior nas escolas rurais (índice médio 0,52 vs. 0,71 nas urbanas; p&lt;0,0001); (iv) crescimento do ensino integral de 56,7% em 2022 para 64,9% em 2024, com 50% das escolas operando em regime 100% integral em 2024; (v) correlações Spearman mais fortes com a taxa de abandono futura: lag de abandono (r≈+0,80), distorção idade-série (r≈+0,55) e nível socioeconômico (INSE, r≈−0,40); (vi) concentração de risco nos municípios da mesorregião do São Francisco Pernambucano, que acumula menores índices de IRD e INSE e maiores taxas de abandono e distorção idade-série. (vii) explicabilidade do modelo definitivo com SHAP, que confirmou o lag de abandono, a reprovação e a distorção idade-série como os principais determinantes do risco previsto, com direções coerentes com a teoria (abandono, reprovação e distorção elevam o risco; nível socioeconômico elevado o reduz); (viii) diagnóstico de equidade: o modelo definitivo mantém superpredição sistemática do abandono nas escolas de localização diferenciada (resíduo médio de −3,99 pontos percentuais na validação temporal), indício de fatores protetivos de vínculo comunitário não capturados pelas variáveis disponíveis.</w:t>
       </w:r>
     </w:p>
     <w:p>
@@ -6254,6 +6254,20 @@
     </w:p>
     <w:p>
       <w:pPr>
+        <w:pStyle w:val="4"/>
+      </w:pPr>
+      <w:r>
+        <w:t>Explicabilidade e Diagnóstico do Modelo</w:t>
+      </w:r>
+    </w:p>
+    <w:p>
+      <w:pPr/>
+      <w:r>
+        <w:t>A sexta fase de implementação dedicou-se à explicabilidade do modelo definitivo e ao diagnóstico das escolas fora do padrão — a pergunta secundária de pesquisa. Sobre o XGBoost serializado foi montado um explicador baseado em valores de Shapley (TreeExplainer da biblioteca SHAP), encapsulado no módulo explain.py, que decompõe cada predição na soma das contribuições de cada variável. Como o modelo final emprega transformação raiz quadrada no alvo, os valores SHAP são expressos em unidades de raiz da taxa de abandono — escala em que o sinal e a ordenação das contribuições permanecem válidos, por ser a raiz uma função monótona —, enquanto as predições e os resíduos são reportados na escala original, em pontos percentuais. A fase produziu a importância global das variáveis, a direção de seu efeito, explicações locais por escola e a reavaliação do viés de superpredição por grupo de localização sobre o modelo definitivo, com resultados apresentados no capítulo de Testes e Análise dos Resultados. Todo o procedimento é coberto por testes automatizados que verificam, entre outras propriedades, a aditividade dos valores SHAP em relação à predição do modelo.</w:t>
+      </w:r>
+    </w:p>
+    <w:p>
+      <w:pPr>
         <w:pStyle w:val="3"/>
       </w:pPr>
       <w:r>
@@ -6272,7 +6286,7 @@
     </w:p>
     <w:p>
       <w:r>
-        <w:t>b) Testes automatizados: os módulos de ETL e de modelagem são cobertos por testes unitários com pytest (test_etl_filters.py, test_panel.py, test_taxas.py, test_build_target.py e test_models.py), que validam os filtros do universo, a integridade do painel longitudinal, o parser das Taxas de Rendimento, a métrica Precision@K e o não-vazamento de municípios entre os folds da validação cruzada, prevenindo regressões a cada alteração no pipeline;</w:t>
+        <w:t>b) Testes automatizados: os módulos de ETL e de modelagem são cobertos por testes unitários com pytest (test_etl_filters.py, test_panel.py, test_taxas.py, test_build_target.py, test_models.py e test_explain.py), que validam os filtros do universo, a integridade do painel longitudinal, o parser das Taxas de Rendimento, a métrica Precision@K e o não-vazamento de municípios entre os folds da validação cruzada e a aditividade dos valores SHAP, prevenindo regressões a cada alteração no pipeline;</w:t>
       </w:r>
     </w:p>
     <w:p>
@@ -6300,7 +6314,7 @@
     </w:p>
     <w:p>
       <w:r>
-        <w:t>Concluído o tuning do modelo principal, as próximas fases compreendem: (i) a análise de explicabilidade com SHAP, decompondo as predições do XGBoost em contribuições por variável, em nível global e por escola; (ii) o aprofundamento da análise de resíduos para identificar escolas com abandono acima ou abaixo do esperado pelo seu perfil contextual — a pergunta secundária de pesquisa —, com reavaliação do viés de superpredição observado nas escolas de localização diferenciada; e (iii) a construção do dashboard interativo em Streamlit voltado aos gestores da Secretaria Estadual de Educação.</w:t>
+        <w:t>Concluídas a modelagem e a explicabilidade do modelo, resta como fase subsequente a construção do dashboard interativo em Streamlit voltado aos gestores da Secretaria Estadual de Educação, que consumirá o modelo serializado para produzir o ranking de risco e as explicações por escola, seguida do empacotamento da aplicação em contêiner para implantação. Os encaminhamentos de modelagem identificados ao longo do projeto — em especial o tratamento do viés de superpredição nas escolas de localização diferenciada e a ampliação da janela temporal à medida que novas edições do Censo sejam publicadas — são retomados no capítulo de conclusões.</w:t>
       </w:r>
     </w:p>
     <w:p>
@@ -6657,7 +6671,7 @@
     </w:p>
     <w:p>
       <w:r>
-        <w:t>Este capítulo apresenta os testes realizados e os resultados obtidos até a conclusão do tuning do modelo principal. A primeira seção descreve os testes de software que asseguram a corretude do pipeline de dados e de modelagem; as seções seguintes apresentam a avaliação experimental dos modelos preditivos — dos baselines ao XGBoost definitivo —, com ênfase na capacidade de priorização de escolas em risco, o propósito central do sistema. Os resultados da análise de explicabilidade (SHAP) serão incorporados ao término da fase subsequente.</w:t>
+        <w:t>Este capítulo apresenta os testes realizados e os resultados obtidos até a conclusão do tuning do modelo principal. A primeira seção descreve os testes de software que asseguram a corretude do pipeline de dados e de modelagem; as seções seguintes apresentam a avaliação experimental dos modelos preditivos — dos baselines ao XGBoost definitivo —, com ênfase na capacidade de priorização de escolas em risco, o propósito central do sistema. A última seção apresenta a explicabilidade do modelo com SHAP e o diagnóstico de equidade sobre o modelo definitivo.</w:t>
       </w:r>
     </w:p>
     <w:p>
@@ -6670,7 +6684,7 @@
     </w:p>
     <w:p>
       <w:r>
-        <w:t>A corretude do pipeline é assegurada por uma suíte de 55 testes unitários automatizados com pytest, executada integralmente a cada alteração — todos aprovados na última execução. Em sistemas de aprendizado de máquina, erros de engenharia de dados frequentemente não lançam exceções: produzem modelos silenciosamente inválidos. Por essa razão, os testes concentram-se nos riscos que comprometeriam a validade científica dos resultados, resumidos no quadro a seguir.</w:t>
+        <w:t>A corretude do pipeline é assegurada por uma suíte de 66 testes unitários automatizados com pytest, executada integralmente a cada alteração — todos aprovados na última execução. Em sistemas de aprendizado de máquina, erros de engenharia de dados frequentemente não lançam exceções: produzem modelos silenciosamente inválidos. Por essa razão, os testes concentram-se nos riscos que comprometeriam a validade científica dos resultados, resumidos no quadro a seguir.</w:t>
       </w:r>
     </w:p>
     <w:p>
@@ -7357,7 +7371,7 @@
     </w:p>
     <w:p>
       <w:r>
-        <w:t>A interpretação provável é a existência de fatores protetivos de vínculo comunitário não capturados pelas variáveis disponíveis, consistente com a limitação declarada na metodologia sobre vieses não controlados. A consequência prática é que, sem correção, um sistema de priorização alocaria atenção excessiva a escolas indígenas e quilombolas que não estão de fato em risco. As vinte escolas com maior resíduo em cada direção foram persistidas como artefato para inspeção qualitativa na fase de explicabilidade, e a reavaliação desse viés após o tuning do XGBoost está registrada como encaminhamento obrigatório.</w:t>
+        <w:t>A interpretação provável é a existência de fatores protetivos de vínculo comunitário não capturados pelas variáveis disponíveis, consistente com a limitação declarada na metodologia sobre vieses não controlados. A consequência prática é que, sem correção, um sistema de priorização alocaria atenção excessiva a escolas indígenas e quilombolas que não estão de fato em risco. As vinte escolas com maior resíduo em cada direção foram persistidas como artefato para inspeção qualitativa na fase de explicabilidade, e a reavaliação desse viés sobre o modelo definitivo é apresentada na seção de explicabilidade, ao final deste capítulo.</w:t>
       </w:r>
     </w:p>
     <w:p>
@@ -7446,12 +7460,264 @@
         <w:pStyle w:val="3"/>
       </w:pPr>
       <w:r>
+        <w:t>Explicabilidade e Diagnóstico do Modelo com SHAP</w:t>
+      </w:r>
+    </w:p>
+    <w:p>
+      <w:pPr/>
+      <w:r>
+        <w:t>Enquanto a importância por ganho da seção anterior mede quanto cada variável reduz o erro nos pontos de divisão das árvores, a explicabilidade por valores de Shapley (SHAP) mede a contribuição média de cada variável para a predição de cada escola, permitindo ler não apenas a magnitude, mas a direção do efeito. A figura a seguir resume essa decomposição para todo o conjunto: o lag da taxa de abandono (abnd_t, |SHAP| médio de 0,148 na escala de raiz) é, de longe, o principal determinante do risco previsto, seguido do abandono da 2ª série (0,098) e da 1ª série (0,050), do nível socioeconômico (INSE, 0,041), da reprovação (0,041) e da distorção idade-série (0,030).</w:t>
+      </w:r>
+    </w:p>
+    <w:p>
+      <w:pPr>
+        <w:pStyle w:val="28"/>
+      </w:pPr>
+      <w:r>
+        <w:t>Figura – Decomposição SHAP global das predições do XGBoost (beeswarm)</w:t>
+      </w:r>
+    </w:p>
+    <w:p>
+      <w:pPr>
+        <w:jc w:val="center"/>
+      </w:pPr>
+      <w:r>
+        <w:drawing>
+          <wp:inline xmlns:a="http://schemas.openxmlformats.org/drawingml/2006/main" xmlns:pic="http://schemas.openxmlformats.org/drawingml/2006/picture">
+            <wp:extent cx="4937760" cy="4692353"/>
+            <wp:docPr id="8" name="Picture 8"/>
+            <wp:cNvGraphicFramePr>
+              <a:graphicFrameLocks noChangeAspect="1"/>
+            </wp:cNvGraphicFramePr>
+            <a:graphic>
+              <a:graphicData uri="http://schemas.openxmlformats.org/drawingml/2006/picture">
+                <pic:pic>
+                  <pic:nvPicPr>
+                    <pic:cNvPr id="0" name="S1_shap_beeswarm.png"/>
+                    <pic:cNvPicPr/>
+                  </pic:nvPicPr>
+                  <pic:blipFill>
+                    <a:blip r:embed="rId18"/>
+                    <a:stretch>
+                      <a:fillRect/>
+                    </a:stretch>
+                  </pic:blipFill>
+                  <pic:spPr>
+                    <a:xfrm>
+                      <a:off x="0" y="0"/>
+                      <a:ext cx="4937760" cy="4692353"/>
+                    </a:xfrm>
+                    <a:prstGeom prst="rect"/>
+                  </pic:spPr>
+                </pic:pic>
+              </a:graphicData>
+            </a:graphic>
+          </wp:inline>
+        </w:drawing>
+      </w:r>
+    </w:p>
+    <w:p>
+      <w:pPr>
+        <w:pStyle w:val="28"/>
+      </w:pPr>
+      <w:r>
+        <w:t>Fonte: elaborado pelo autor.</w:t>
+      </w:r>
+    </w:p>
+    <w:p>
+      <w:pPr/>
+      <w:r>
+        <w:t>As cores do gráfico de dispersão confirmam que as direções dos efeitos são coerentes com a literatura: valores altos das taxas de abandono e reprovação defasadas e da distorção idade-série empurram a predição para cima (maior risco), ao passo que valores altos do INSE a empurram para baixo — a correlação entre o valor do INSE e sua contribuição SHAP é de −0,74. A figura seguinte ordena as variáveis por |SHAP| médio e codifica essa direção por cor. Cabe registrar uma divergência metodológica relevante em relação à importância por ganho: a variável binária de localização diferenciada, apontada como a de maior ganho, não figura entre as mais influentes pela métrica SHAP. A razão é que essa variável marca um número reduzido de escolas e, quando usada em uma divisão, separa grupos muito homogêneos — o que infla o ganho por divisão —, mas, por afetar poucas observações, contribui pouco para a predição média do conjunto. As duas métricas são, portanto, complementares: o ganho destaca variáveis de alta pureza local, e o SHAP, as de maior contribuição média global.</w:t>
+      </w:r>
+    </w:p>
+    <w:p>
+      <w:pPr>
+        <w:pStyle w:val="28"/>
+      </w:pPr>
+      <w:r>
+        <w:t>Figura – Importância e direção das variáveis por |SHAP| médio</w:t>
+      </w:r>
+    </w:p>
+    <w:p>
+      <w:pPr>
+        <w:jc w:val="center"/>
+      </w:pPr>
+      <w:r>
+        <w:drawing>
+          <wp:inline xmlns:a="http://schemas.openxmlformats.org/drawingml/2006/main" xmlns:pic="http://schemas.openxmlformats.org/drawingml/2006/picture">
+            <wp:extent cx="5394960" cy="3552187"/>
+            <wp:docPr id="9" name="Picture 9"/>
+            <wp:cNvGraphicFramePr>
+              <a:graphicFrameLocks noChangeAspect="1"/>
+            </wp:cNvGraphicFramePr>
+            <a:graphic>
+              <a:graphicData uri="http://schemas.openxmlformats.org/drawingml/2006/picture">
+                <pic:pic>
+                  <pic:nvPicPr>
+                    <pic:cNvPr id="0" name="S2_shap_direcao.png"/>
+                    <pic:cNvPicPr/>
+                  </pic:nvPicPr>
+                  <pic:blipFill>
+                    <a:blip r:embed="rId19"/>
+                    <a:stretch>
+                      <a:fillRect/>
+                    </a:stretch>
+                  </pic:blipFill>
+                  <pic:spPr>
+                    <a:xfrm>
+                      <a:off x="0" y="0"/>
+                      <a:ext cx="5394960" cy="3552187"/>
+                    </a:xfrm>
+                    <a:prstGeom prst="rect"/>
+                  </pic:spPr>
+                </pic:pic>
+              </a:graphicData>
+            </a:graphic>
+          </wp:inline>
+        </w:drawing>
+      </w:r>
+    </w:p>
+    <w:p>
+      <w:pPr>
+        <w:pStyle w:val="28"/>
+      </w:pPr>
+      <w:r>
+        <w:t>Fonte: elaborado pelo autor.</w:t>
+      </w:r>
+    </w:p>
+    <w:p>
+      <w:pPr/>
+      <w:r>
+        <w:t>A decomposição é também local: para qualquer escola, é possível mostrar como cada variável afastou sua predição do valor médio. A figura a seguir ilustra o caso da escola de maior risco previsto — uma escola estadual indígena no município de Jatobá, com 23,9% de abandono previsto e 39,1% observado em 2022. Partindo da predição média do conjunto (E[f(x)] = 0,49 na escala de raiz), as maiores contribuições positivas vêm do lag de abandono (+0,74), da distorção idade-série (+0,64) e do abandono da 2ª série (+0,41), que somadas constroem o escore elevado de risco. Esse tipo de explicação por escola é o insumo que o dashboard apresentará ao gestor para justificar cada indicação de prioridade.</w:t>
+      </w:r>
+    </w:p>
+    <w:p>
+      <w:pPr>
+        <w:pStyle w:val="28"/>
+      </w:pPr>
+      <w:r>
+        <w:t>Figura – Explicação local (waterfall) da escola de maior risco previsto</w:t>
+      </w:r>
+    </w:p>
+    <w:p>
+      <w:pPr>
+        <w:jc w:val="center"/>
+      </w:pPr>
+      <w:r>
+        <w:drawing>
+          <wp:inline xmlns:a="http://schemas.openxmlformats.org/drawingml/2006/main" xmlns:pic="http://schemas.openxmlformats.org/drawingml/2006/picture">
+            <wp:extent cx="5120640" cy="4734662"/>
+            <wp:docPr id="10" name="Picture 10"/>
+            <wp:cNvGraphicFramePr>
+              <a:graphicFrameLocks noChangeAspect="1"/>
+            </wp:cNvGraphicFramePr>
+            <a:graphic>
+              <a:graphicData uri="http://schemas.openxmlformats.org/drawingml/2006/picture">
+                <pic:pic>
+                  <pic:nvPicPr>
+                    <pic:cNvPr id="0" name="S3_waterfall_alto_risco.png"/>
+                    <pic:cNvPicPr/>
+                  </pic:nvPicPr>
+                  <pic:blipFill>
+                    <a:blip r:embed="rId20"/>
+                    <a:stretch>
+                      <a:fillRect/>
+                    </a:stretch>
+                  </pic:blipFill>
+                  <pic:spPr>
+                    <a:xfrm>
+                      <a:off x="0" y="0"/>
+                      <a:ext cx="5120640" cy="4734662"/>
+                    </a:xfrm>
+                    <a:prstGeom prst="rect"/>
+                  </pic:spPr>
+                </pic:pic>
+              </a:graphicData>
+            </a:graphic>
+          </wp:inline>
+        </w:drawing>
+      </w:r>
+    </w:p>
+    <w:p>
+      <w:pPr>
+        <w:pStyle w:val="28"/>
+      </w:pPr>
+      <w:r>
+        <w:t>Fonte: elaborado pelo autor.</w:t>
+      </w:r>
+    </w:p>
+    <w:p>
+      <w:pPr/>
+      <w:r>
+        <w:t>Por fim, a análise de resíduos foi reavaliada sobre o modelo definitivo, cumprindo o encaminhamento registrado anteriormente. A figura a seguir apresenta o resíduo (real − previsto) do XGBoost por grupo de localização na validação temporal. O viés sistemático identificado nos baselines persiste após o tuning: as escolas urbanas e rurais têm resíduo médio próximo de zero (+0,42 e +0,71 ponto percentual, respectivamente), enquanto as escolas de localização diferenciada — terras indígenas e comunidades quilombolas — mantêm superpredição acentuada (resíduo médio de −3,99 pontos percentuais, n = 41), praticamente idêntica à observada com o Ridge (−4,09). O modelo prevê para essas escolas um abandono elevado, condizente com seu perfil contextual (rural, baixo INSE, alta distorção idade-série), mas o abandono observado é próximo de zero. O achado reforça a hipótese de fatores protetivos de vínculo comunitário não capturados pelas variáveis disponíveis e tem consequência prática direta: um ranking de priorização não corrigido alocaria atenção excessiva a essas escolas. Recomenda-se, por isso, exibir o resíduo ao gestor como sinal de cautela e tratar a correção desse viés como trabalho futuro.</w:t>
+      </w:r>
+    </w:p>
+    <w:p>
+      <w:pPr>
+        <w:pStyle w:val="28"/>
+      </w:pPr>
+      <w:r>
+        <w:t>Figura – Resíduo do XGBoost por grupo de localização (validação temporal)</w:t>
+      </w:r>
+    </w:p>
+    <w:p>
+      <w:pPr>
+        <w:jc w:val="center"/>
+      </w:pPr>
+      <w:r>
+        <w:drawing>
+          <wp:inline xmlns:a="http://schemas.openxmlformats.org/drawingml/2006/main" xmlns:pic="http://schemas.openxmlformats.org/drawingml/2006/picture">
+            <wp:extent cx="5577840" cy="2137114"/>
+            <wp:docPr id="11" name="Picture 11"/>
+            <wp:cNvGraphicFramePr>
+              <a:graphicFrameLocks noChangeAspect="1"/>
+            </wp:cNvGraphicFramePr>
+            <a:graphic>
+              <a:graphicData uri="http://schemas.openxmlformats.org/drawingml/2006/picture">
+                <pic:pic>
+                  <pic:nvPicPr>
+                    <pic:cNvPr id="0" name="S5_equidade_grupos.png"/>
+                    <pic:cNvPicPr/>
+                  </pic:nvPicPr>
+                  <pic:blipFill>
+                    <a:blip r:embed="rId21"/>
+                    <a:stretch>
+                      <a:fillRect/>
+                    </a:stretch>
+                  </pic:blipFill>
+                  <pic:spPr>
+                    <a:xfrm>
+                      <a:off x="0" y="0"/>
+                      <a:ext cx="5577840" cy="2137114"/>
+                    </a:xfrm>
+                    <a:prstGeom prst="rect"/>
+                  </pic:spPr>
+                </pic:pic>
+              </a:graphicData>
+            </a:graphic>
+          </wp:inline>
+        </w:drawing>
+      </w:r>
+    </w:p>
+    <w:p>
+      <w:pPr>
+        <w:pStyle w:val="28"/>
+      </w:pPr>
+      <w:r>
+        <w:t>Fonte: elaborado pelo autor.</w:t>
+      </w:r>
+    </w:p>
+    <w:p>
+      <w:pPr>
+        <w:pStyle w:val="3"/>
+      </w:pPr>
+      <w:r>
         <w:t>Síntese dos Resultados</w:t>
       </w:r>
     </w:p>
     <w:p>
       <w:r>
-        <w:t>Os resultados obtidos até esta etapa sustentam parcialmente a pergunta principal de pesquisa: é possível, a partir de indicadores institucionais e contextuais do ano t, ordenar as escolas estaduais de Ensino Médio de Pernambuco por risco de abandono em t+1 com qualidade útil para priorização. O XGBoost, modelo definitivo, confirmou-se o melhor nas dimensões alinhadas a esse objetivo: a maior correlação de Spearman (0,458 em validação cruzada repetida e 0,390 na validação temporal), o menor erro absoluto médio e ROC-AUC de 0,830 na validação temporal, atingindo as metas de ROC-AUC ≥ 0,83 e de Spearman ≥ 0,43 fixadas a partir dos baselines. A meta de RMSE, em contrapartida, não foi superada: o XGBoost não reduziu o RMSE em relação ao Random Forest, e a magnitude da taxa não generaliza entre ciclos (R² negativo na validação temporal) com apenas dois pares de anos disponíveis — limitação que o tuning atenuou, mas não eliminou. Permanecem como encaminhamentos para as fases seguintes a explicabilidade com SHAP e a reavaliação, sobre o modelo definitivo, do viés de superpredição nas escolas de localização diferenciada.</w:t>
+        <w:t>Os resultados obtidos até esta etapa sustentam parcialmente a pergunta principal de pesquisa: é possível, a partir de indicadores institucionais e contextuais do ano t, ordenar as escolas estaduais de Ensino Médio de Pernambuco por risco de abandono em t+1 com qualidade útil para priorização. O XGBoost, modelo definitivo, confirmou-se o melhor nas dimensões alinhadas a esse objetivo: a maior correlação de Spearman (0,458 em validação cruzada repetida e 0,390 na validação temporal), o menor erro absoluto médio e ROC-AUC de 0,830 na validação temporal, atingindo as metas de ROC-AUC ≥ 0,83 e de Spearman ≥ 0,43 fixadas a partir dos baselines. A meta de RMSE, em contrapartida, não foi superada: o XGBoost não reduziu o RMSE em relação ao Random Forest, e a magnitude da taxa não generaliza entre ciclos (R² negativo na validação temporal) com apenas dois pares de anos disponíveis — limitação que o tuning atenuou, mas não eliminou. A explicabilidade com SHAP confirmou o lag de abandono, a reprovação e a distorção idade-série como os principais determinantes do risco previsto, com direções coerentes com a teoria, e a reavaliação dos resíduos sobre o modelo definitivo confirmou a persistência do viés de superpredição nas escolas de localização diferenciada (−3,99 pontos percentuais na validação temporal). Permanece como encaminhamento para a fase seguinte a construção do dashboard de priorização, além da correção desse viés e da ampliação da janela temporal, discutidas nas conclusões.</w:t>
       </w:r>
     </w:p>
     <w:p>

</xml_diff>

<commit_message>
arquivo revisado, arquitetura de software
</commit_message>
<xml_diff>
--- a/Modelo TCC Engenharia de Software 2022.docx
+++ b/Modelo TCC Engenharia de Software 2022.docx
@@ -6367,36 +6367,7 @@
         </w:rPr>
       </w:pPr>
       <w:r>
-        <w:rPr>
-          <w:color w:val="2E75B6" w:themeColor="accent5" w:themeShade="BF"/>
-        </w:rPr>
-        <w:t>&lt;apresentar a arquitetura do software desenvolvido. Utilizar algum framework de representação arquitetural. A sugestão de subseções abaixo segue o modelo “4+1” de Kruchten</w:t>
-      </w:r>
-      <w:r>
-        <w:rPr>
-          <w:rStyle w:val="16"/>
-          <w:color w:val="2E75B6" w:themeColor="accent5" w:themeShade="BF"/>
-        </w:rPr>
-        <w:footnoteReference w:id="0"/>
-      </w:r>
-      <w:r>
-        <w:rPr>
-          <w:color w:val="2E75B6" w:themeColor="accent5" w:themeShade="BF"/>
-        </w:rPr>
-        <w:t>. Dependendo do tipo de projeto outro modelo ou padrão de arquitetural poderá ser utilizado. Uma linguagem de descrição arquitetural (ADL</w:t>
-      </w:r>
-      <w:r>
-        <w:rPr>
-          <w:rStyle w:val="16"/>
-          <w:color w:val="2E75B6" w:themeColor="accent5" w:themeShade="BF"/>
-        </w:rPr>
-        <w:footnoteReference w:id="1"/>
-      </w:r>
-      <w:r>
-        <w:rPr>
-          <w:color w:val="2E75B6" w:themeColor="accent5" w:themeShade="BF"/>
-        </w:rPr>
-        <w:t>, Architecture description language) deverá ser usada para apresentar as visões arquiteturais do sistema de software&gt;</w:t>
+        <w:t>A arquitetura do sistema é descrita segundo o modelo de visões 4+1 de Kruchten, adaptado à natureza do software: trata-se de um pipeline de ciência de dados cujo núcleo são módulos de transformação de dados e de modelagem, e não um sistema orientado a objetos com hierarquias de classes. Por essa razão, a visão lógica é apresentada por meio de diagramas de pacotes e de componentes — que refletem fielmente a organização do código em camadas — em vez de um diagrama de classes. As visões são expressas em notação UML. O sistema organiza-se em quatro camadas de responsabilidade única — aquisição e preparação de dados (src.data), engenharia de atributos (src.features), modelagem e explicabilidade (src.models) e recomendação/visualização (src.recommend) —, sustentadas por uma camada transversal de configuração (config) e por convenções de persistência em disco (raw → interim → processed e modelos serializados). As subseções seguintes detalham os aspectos funcionais e não funcionais e as visões estrutural, comportamental e de implantação.</w:t>
       </w:r>
     </w:p>
     <w:p>
@@ -6433,10 +6404,68 @@
         </w:rPr>
       </w:pPr>
       <w:r>
-        <w:rPr>
-          <w:color w:val="2E75B6" w:themeColor="accent5" w:themeShade="BF"/>
-        </w:rPr>
-        <w:t>&lt;discussão dos principais requisitos funcionais e não funcionais do sistema proposto. Recomenda-se usar o diagrama de casos de uso UML&gt;</w:t>
+        <w:t>Os requisitos funcionais do sistema decorrem diretamente das perguntas de pesquisa e do usuário-alvo, o gestor da Secretaria Estadual de Educação. A figura a seguir apresenta o diagrama de casos de uso. O caso de uso central é consultar o ranking de risco de abandono das escolas para o ano t+1 (RF1); a ele somam-se visualizar a explicação individual de cada escola por valores SHAP (RF2) e inspecionar o diagnóstico de resíduos, que sinaliza escolas cujo abandono observado diverge do previsto pelo seu perfil (RF3). Esses três casos atendem ao gestor. Um segundo ator, o analista ou pesquisador, responde pelos casos de uso de manutenção do sistema: executar o pipeline de dados, da extração à geração do conjunto de modelagem (RF4), e treinar ou atualizar o modelo preditivo (RF5). O INEP figura como ator de apoio, fornecedor dos microdados que alimentam o pipeline.</w:t>
+      </w:r>
+    </w:p>
+    <w:p>
+      <w:pPr>
+        <w:pStyle w:val="28"/>
+      </w:pPr>
+      <w:r>
+        <w:t>Figura – Diagrama de casos de uso</w:t>
+      </w:r>
+    </w:p>
+    <w:p>
+      <w:pPr>
+        <w:jc w:val="center"/>
+      </w:pPr>
+      <w:r>
+        <w:drawing>
+          <wp:inline xmlns:a="http://schemas.openxmlformats.org/drawingml/2006/main" xmlns:pic="http://schemas.openxmlformats.org/drawingml/2006/picture">
+            <wp:extent cx="5394960" cy="3391503"/>
+            <wp:docPr id="12" name="Picture 12"/>
+            <wp:cNvGraphicFramePr>
+              <a:graphicFrameLocks noChangeAspect="1"/>
+            </wp:cNvGraphicFramePr>
+            <a:graphic>
+              <a:graphicData uri="http://schemas.openxmlformats.org/drawingml/2006/picture">
+                <pic:pic>
+                  <pic:nvPicPr>
+                    <pic:cNvPr id="0" name="arq1_casos_uso.png"/>
+                    <pic:cNvPicPr/>
+                  </pic:nvPicPr>
+                  <pic:blipFill>
+                    <a:blip r:embed="rId22"/>
+                    <a:stretch>
+                      <a:fillRect/>
+                    </a:stretch>
+                  </pic:blipFill>
+                  <pic:spPr>
+                    <a:xfrm>
+                      <a:off x="0" y="0"/>
+                      <a:ext cx="5394960" cy="3391503"/>
+                    </a:xfrm>
+                    <a:prstGeom prst="rect"/>
+                  </pic:spPr>
+                </pic:pic>
+              </a:graphicData>
+            </a:graphic>
+          </wp:inline>
+        </w:drawing>
+      </w:r>
+    </w:p>
+    <w:p>
+      <w:pPr>
+        <w:pStyle w:val="28"/>
+      </w:pPr>
+      <w:r>
+        <w:t>Fonte: elaborado pelo autor.</w:t>
+      </w:r>
+    </w:p>
+    <w:p>
+      <w:pPr/>
+      <w:r>
+        <w:t>Entre os requisitos não funcionais, destacam-se: (i) reprodutibilidade — qualquer resultado deve ser reconstruível a partir dos dados brutos imutáveis, com ambiente e dependências fixados; (ii) interpretabilidade — o modelo precisa justificar cada indicação de prioridade, requisito que orientou a escolha por um modelo baseado em árvores acompanhado de explicações SHAP, em vez de uma caixa-preta; (iii) ausência de vazamento de dados — a validação deve respeitar a estrutura temporal (features de t, alvo em t+1) e espacial (agrupamento por município), sob pena de métricas otimistas; (iv) testabilidade — cada módulo do pipeline é coberto por testes automatizados; e (v) portabilidade — a aplicação de visualização deve ser empacotável em contêiner para implantação sem dependência do ambiente de desenvolvimento. Esses requisitos permeiam as decisões arquiteturais discutidas a seguir.</w:t>
       </w:r>
     </w:p>
     <w:p>
@@ -6481,10 +6510,123 @@
         </w:rPr>
       </w:pPr>
       <w:r>
-        <w:rPr>
-          <w:color w:val="2E75B6" w:themeColor="accent5" w:themeShade="BF"/>
-        </w:rPr>
-        <w:t>&lt;visão estrutural do software. Recomenda-se usar os seguintes diagramas da UML: diagrama de pacotes, diagrama de componentes e diagrama de classes&gt;</w:t>
+        <w:t>A visão estrutural é apresentada em dois níveis. No nível de código-fonte, a figura a seguir exibe o diagrama de pacotes. A dependência flui em sentido único, das camadas superiores para as inferiores, sem ciclos: src.features depende de src.data; src.models depende de src.features; e src.recommend — a aplicação de visualização, planejada — depende de src.models. O pacote src.data.config é transversal, importado pelas demais camadas para centralizar caminhos e anos de referência. Os pacotes notebooks e tests consomem as camadas de src — os primeiros como scripts de análise que orquestram o pipeline, os segundos como verificação automatizada —, mas nenhuma camada de produção depende deles. Essa orientação acíclica das dependências é o que garante que cada camada possa ser testada e reexecutada isoladamente.</w:t>
+      </w:r>
+    </w:p>
+    <w:p>
+      <w:pPr>
+        <w:pStyle w:val="28"/>
+      </w:pPr>
+      <w:r>
+        <w:t>Figura – Diagrama de pacotes (visão estrutural)</w:t>
+      </w:r>
+    </w:p>
+    <w:p>
+      <w:pPr>
+        <w:jc w:val="center"/>
+      </w:pPr>
+      <w:r>
+        <w:drawing>
+          <wp:inline xmlns:a="http://schemas.openxmlformats.org/drawingml/2006/main" xmlns:pic="http://schemas.openxmlformats.org/drawingml/2006/picture">
+            <wp:extent cx="4572000" cy="3412495"/>
+            <wp:docPr id="13" name="Picture 13"/>
+            <wp:cNvGraphicFramePr>
+              <a:graphicFrameLocks noChangeAspect="1"/>
+            </wp:cNvGraphicFramePr>
+            <a:graphic>
+              <a:graphicData uri="http://schemas.openxmlformats.org/drawingml/2006/picture">
+                <pic:pic>
+                  <pic:nvPicPr>
+                    <pic:cNvPr id="0" name="arq2_pacotes.png"/>
+                    <pic:cNvPicPr/>
+                  </pic:nvPicPr>
+                  <pic:blipFill>
+                    <a:blip r:embed="rId23"/>
+                    <a:stretch>
+                      <a:fillRect/>
+                    </a:stretch>
+                  </pic:blipFill>
+                  <pic:spPr>
+                    <a:xfrm>
+                      <a:off x="0" y="0"/>
+                      <a:ext cx="4572000" cy="3412495"/>
+                    </a:xfrm>
+                    <a:prstGeom prst="rect"/>
+                  </pic:spPr>
+                </pic:pic>
+              </a:graphicData>
+            </a:graphic>
+          </wp:inline>
+        </w:drawing>
+      </w:r>
+    </w:p>
+    <w:p>
+      <w:pPr>
+        <w:pStyle w:val="28"/>
+      </w:pPr>
+      <w:r>
+        <w:t>Fonte: elaborado pelo autor.</w:t>
+      </w:r>
+    </w:p>
+    <w:p>
+      <w:pPr/>
+      <w:r>
+        <w:t>No nível de execução, a figura seguinte apresenta o diagrama de componentes e o fluxo de dados que os conecta. O componente de ETL (src.data) lê os microdados brutos do INEP e grava produtos intermediários padronizados em data/interim; o componente de engenharia de atributos (src.features) os consome e materializa o conjunto final em data/processed; o componente de modelagem (src.models, módulos train e evaluate) treina e avalia o modelo, serializando-o em models/; e os componentes de explicabilidade (módulo explain) e de dashboard (src.recommend) carregam o modelo serializado para, respectivamente, produzir as explicações SHAP e apresentar o ranking ao gestor. A comunicação entre componentes se dá sempre por artefatos persistidos em disco (Parquet e joblib), e não por chamadas diretas — um acoplamento fraco que permite reexecutar qualquer etapa a partir do artefato da etapa anterior.</w:t>
+      </w:r>
+    </w:p>
+    <w:p>
+      <w:pPr>
+        <w:pStyle w:val="28"/>
+      </w:pPr>
+      <w:r>
+        <w:t>Figura – Diagrama de componentes e fluxo de dados</w:t>
+      </w:r>
+    </w:p>
+    <w:p>
+      <w:pPr>
+        <w:jc w:val="center"/>
+      </w:pPr>
+      <w:r>
+        <w:drawing>
+          <wp:inline xmlns:a="http://schemas.openxmlformats.org/drawingml/2006/main" xmlns:pic="http://schemas.openxmlformats.org/drawingml/2006/picture">
+            <wp:extent cx="5669280" cy="3467450"/>
+            <wp:docPr id="14" name="Picture 14"/>
+            <wp:cNvGraphicFramePr>
+              <a:graphicFrameLocks noChangeAspect="1"/>
+            </wp:cNvGraphicFramePr>
+            <a:graphic>
+              <a:graphicData uri="http://schemas.openxmlformats.org/drawingml/2006/picture">
+                <pic:pic>
+                  <pic:nvPicPr>
+                    <pic:cNvPr id="0" name="arq3_componentes.png"/>
+                    <pic:cNvPicPr/>
+                  </pic:nvPicPr>
+                  <pic:blipFill>
+                    <a:blip r:embed="rId24"/>
+                    <a:stretch>
+                      <a:fillRect/>
+                    </a:stretch>
+                  </pic:blipFill>
+                  <pic:spPr>
+                    <a:xfrm>
+                      <a:off x="0" y="0"/>
+                      <a:ext cx="5669280" cy="3467450"/>
+                    </a:xfrm>
+                    <a:prstGeom prst="rect"/>
+                  </pic:spPr>
+                </pic:pic>
+              </a:graphicData>
+            </a:graphic>
+          </wp:inline>
+        </w:drawing>
+      </w:r>
+    </w:p>
+    <w:p>
+      <w:pPr>
+        <w:pStyle w:val="28"/>
+      </w:pPr>
+      <w:r>
+        <w:t>Fonte: elaborado pelo autor.</w:t>
       </w:r>
     </w:p>
     <w:p>
@@ -6521,10 +6663,62 @@
         </w:rPr>
       </w:pPr>
       <w:r>
-        <w:rPr>
-          <w:color w:val="2E75B6" w:themeColor="accent5" w:themeShade="BF"/>
-        </w:rPr>
-        <w:t>&lt;visão comportamental do software. Recomenda-se usar os seguintes diagramas da UML: diagrama de interação, diagrama de atividades e diagrama de estados&gt;</w:t>
+        <w:t>A visão comportamental descreve a ordem de execução do pipeline, da aquisição dos dados à disponibilização do ranking. A figura a seguir apresenta o diagrama de atividades. O fluxo é essencialmente sequencial, refletindo as dependências de dados entre as etapas: a carga dos microdados precede a filtragem do universo (escolas estaduais ativas de Ensino Médio em Pernambuco), que precede a montagem do painel longitudinal escola×ano; sobre o painel são integrados os indicadores complementares (Taxas de Rendimento, INSE, IRD, TDI e AFD) e, em seguida, construídas as features do ano t associadas ao alvo do ano t+1. A etapa de modelagem treina os baselines e realiza o tuning do XGBoost, avalia-o sob validação cruzada agrupada e validação temporal, e serializa o modelo definitivo; por fim, a etapa de explicabilidade decompõe as predições com SHAP e diagnostica os resíduos. A atividade final — servir o ranking e as explicações no dashboard — está planejada para a fase subsequente. Cada atividade corresponde a um módulo testável do pacote src, e sua conclusão produz um artefato verificável, o que permite retomar o fluxo a partir de qualquer ponto.</w:t>
+      </w:r>
+    </w:p>
+    <w:p>
+      <w:pPr>
+        <w:pStyle w:val="28"/>
+      </w:pPr>
+      <w:r>
+        <w:t>Figura – Diagrama de atividades do pipeline</w:t>
+      </w:r>
+    </w:p>
+    <w:p>
+      <w:pPr>
+        <w:jc w:val="center"/>
+      </w:pPr>
+      <w:r>
+        <w:drawing>
+          <wp:inline xmlns:a="http://schemas.openxmlformats.org/drawingml/2006/main" xmlns:pic="http://schemas.openxmlformats.org/drawingml/2006/picture">
+            <wp:extent cx="3657600" cy="6178449"/>
+            <wp:docPr id="15" name="Picture 15"/>
+            <wp:cNvGraphicFramePr>
+              <a:graphicFrameLocks noChangeAspect="1"/>
+            </wp:cNvGraphicFramePr>
+            <a:graphic>
+              <a:graphicData uri="http://schemas.openxmlformats.org/drawingml/2006/picture">
+                <pic:pic>
+                  <pic:nvPicPr>
+                    <pic:cNvPr id="0" name="arq4_atividades.png"/>
+                    <pic:cNvPicPr/>
+                  </pic:nvPicPr>
+                  <pic:blipFill>
+                    <a:blip r:embed="rId25"/>
+                    <a:stretch>
+                      <a:fillRect/>
+                    </a:stretch>
+                  </pic:blipFill>
+                  <pic:spPr>
+                    <a:xfrm>
+                      <a:off x="0" y="0"/>
+                      <a:ext cx="3657600" cy="6178449"/>
+                    </a:xfrm>
+                    <a:prstGeom prst="rect"/>
+                  </pic:spPr>
+                </pic:pic>
+              </a:graphicData>
+            </a:graphic>
+          </wp:inline>
+        </w:drawing>
+      </w:r>
+    </w:p>
+    <w:p>
+      <w:pPr>
+        <w:pStyle w:val="28"/>
+      </w:pPr>
+      <w:r>
+        <w:t>Fonte: elaborado pelo autor.</w:t>
       </w:r>
     </w:p>
     <w:p>
@@ -6561,10 +6755,62 @@
         </w:rPr>
       </w:pPr>
       <w:r>
-        <w:rPr>
-          <w:color w:val="2E75B6" w:themeColor="accent5" w:themeShade="BF"/>
-        </w:rPr>
-        <w:t>&lt;visão da implementação dos componentes de software e sua distribuição em diferentes nós da rede (implantação). Recomenda-se usar o diagrama de implantação UML&gt;</w:t>
+        <w:t>A figura a seguir apresenta o diagrama de implantação. No ambiente atual, todo o pipeline executa em uma única estação de desenvolvimento, sobre um ambiente Python isolado em virtualenv com dependências fixadas; os dados, nas três camadas raw, interim e processed, e os modelos serializados residem no sistema de arquivos local, em Parquet e joblib, respectivamente. A implantação prevista para a aplicação de visualização adota um contêiner Docker que encapsula a aplicação Streamlit (src.recommend) e o modelo serializado, eliminando a dependência do ambiente de desenvolvimento e atendendo ao requisito de portabilidade; o gestor acessa o dashboard pelo navegador, via HTTP. A separação entre o ambiente de treino — onde o modelo é produzido e versionado como artefato — e o ambiente de execução — que apenas carrega o artefato para inferência e visualização — é deliberada: permite atualizar o modelo sem alterar a aplicação e vice-versa.</w:t>
+      </w:r>
+    </w:p>
+    <w:p>
+      <w:pPr>
+        <w:pStyle w:val="28"/>
+      </w:pPr>
+      <w:r>
+        <w:t>Figura – Diagrama de implantação</w:t>
+      </w:r>
+    </w:p>
+    <w:p>
+      <w:pPr>
+        <w:jc w:val="center"/>
+      </w:pPr>
+      <w:r>
+        <w:drawing>
+          <wp:inline xmlns:a="http://schemas.openxmlformats.org/drawingml/2006/main" xmlns:pic="http://schemas.openxmlformats.org/drawingml/2006/picture">
+            <wp:extent cx="5577840" cy="3382402"/>
+            <wp:docPr id="16" name="Picture 16"/>
+            <wp:cNvGraphicFramePr>
+              <a:graphicFrameLocks noChangeAspect="1"/>
+            </wp:cNvGraphicFramePr>
+            <a:graphic>
+              <a:graphicData uri="http://schemas.openxmlformats.org/drawingml/2006/picture">
+                <pic:pic>
+                  <pic:nvPicPr>
+                    <pic:cNvPr id="0" name="arq5_implantacao.png"/>
+                    <pic:cNvPicPr/>
+                  </pic:nvPicPr>
+                  <pic:blipFill>
+                    <a:blip r:embed="rId26"/>
+                    <a:stretch>
+                      <a:fillRect/>
+                    </a:stretch>
+                  </pic:blipFill>
+                  <pic:spPr>
+                    <a:xfrm>
+                      <a:off x="0" y="0"/>
+                      <a:ext cx="5577840" cy="3382402"/>
+                    </a:xfrm>
+                    <a:prstGeom prst="rect"/>
+                  </pic:spPr>
+                </pic:pic>
+              </a:graphicData>
+            </a:graphic>
+          </wp:inline>
+        </w:drawing>
+      </w:r>
+    </w:p>
+    <w:p>
+      <w:pPr>
+        <w:pStyle w:val="28"/>
+      </w:pPr>
+      <w:r>
+        <w:t>Fonte: elaborado pelo autor.</w:t>
       </w:r>
     </w:p>
     <w:p>

</xml_diff>